<commit_message>
atualizando modelo de negócio canvas
</commit_message>
<xml_diff>
--- a/DayPlannio.docx
+++ b/DayPlannio.docx
@@ -14869,29 +14869,26 @@
         <w:ind w:firstLine="0"/>
       </w:pPr>
       <w:r>
-        <w:rPr>
-          <w:noProof/>
-        </w:rPr>
         <w:drawing>
-          <wp:inline distT="0" distB="0" distL="0" distR="0" wp14:anchorId="529ECB64" wp14:editId="30ED97F1">
-            <wp:extent cx="5757333" cy="3238499"/>
-            <wp:effectExtent l="0" t="0" r="0" b="635"/>
-            <wp:docPr id="340932398" name="drawing"/>
+          <wp:inline wp14:editId="7C7E6D3C" wp14:anchorId="24B2F8A4">
+            <wp:extent cx="5762625" cy="3238500"/>
+            <wp:effectExtent l="0" t="0" r="0" b="0"/>
+            <wp:docPr id="1119327880" name="drawing"/>
             <wp:cNvGraphicFramePr>
-              <a:graphicFrameLocks xmlns:a="http://schemas.openxmlformats.org/drawingml/2006/main" noChangeAspect="1"/>
+              <a:graphicFrameLocks noChangeAspect="1"/>
             </wp:cNvGraphicFramePr>
-            <a:graphic xmlns:a="http://schemas.openxmlformats.org/drawingml/2006/main">
-              <a:graphicData uri="http://schemas.openxmlformats.org/drawingml/2006/picture">
+            <a:graphic>
+              <a:graphicData xmlns:a="http://schemas.openxmlformats.org/drawingml/2006/main" uri="http://schemas.openxmlformats.org/drawingml/2006/picture">
                 <pic:pic xmlns:pic="http://schemas.openxmlformats.org/drawingml/2006/picture">
                   <pic:nvPicPr>
-                    <pic:cNvPr id="340932398" name=""/>
+                    <pic:cNvPr id="1119327880" name="Picture 1119327880"/>
                     <pic:cNvPicPr/>
                   </pic:nvPicPr>
                   <pic:blipFill>
-                    <a:blip r:embed="rId14" cstate="print">
+                    <a:blip xmlns:r="http://schemas.openxmlformats.org/officeDocument/2006/relationships" r:embed="rId376610477">
                       <a:extLst>
                         <a:ext uri="{28A0092B-C50C-407E-A947-70E740481C1C}">
-                          <a14:useLocalDpi xmlns:a14="http://schemas.microsoft.com/office/drawing/2010/main" val="0"/>
+                          <a14:useLocalDpi xmlns:a14="http://schemas.microsoft.com/office/drawing/2010/main"/>
                         </a:ext>
                       </a:extLst>
                     </a:blip>
@@ -14902,7 +14899,7 @@
                   <pic:spPr>
                     <a:xfrm>
                       <a:off x="0" y="0"/>
-                      <a:ext cx="5757333" cy="3238499"/>
+                      <a:ext cx="5762625" cy="3238500"/>
                     </a:xfrm>
                     <a:prstGeom prst="rect">
                       <a:avLst/>
@@ -14953,20 +14950,46 @@
       <w:bookmarkStart w:name="_Toc165310882" w:id="99"/>
       <w:r>
         <w:rPr>
-          <w:b/>
-          <w:bCs/>
+          <w:b w:val="1"/>
+          <w:bCs w:val="1"/>
         </w:rPr>
         <w:t>Proposta de valor</w:t>
       </w:r>
       <w:bookmarkEnd w:id="99"/>
     </w:p>
     <w:p>
-      <w:r>
-        <w:rPr>
-          <w:rFonts w:eastAsia="Arial" w:cs="Arial"/>
+      <w:pPr>
+        <w:pStyle w:val="Normal"/>
+      </w:pPr>
+      <w:r>
+        <w:rPr>
+          <w:rFonts w:ascii="Arial" w:hAnsi="Arial" w:eastAsia="Arial" w:cs="Arial"/>
+          <w:noProof w:val="0"/>
+          <w:sz w:val="24"/>
           <w:szCs w:val="24"/>
-        </w:rPr>
-        <w:t>Um aplicativo com uma interface intuitiva, permitindo que qualquer pessoa utilize sem necessitar de muito aprendizado sobre a plataforma, tem o foco de substituir o trabalho manual do usuário para realizar um gerenciamento automático simplificado tirando o foco de termos técnico e não acessíveis.</w:t>
+          <w:lang w:val="pt-BR"/>
+        </w:rPr>
+        <w:t xml:space="preserve">Um aplicativo mobile com interface intuitiva, que permite ao prestador de serviços utilizá-lo sem necessitar de muito aprendizado sobre a plataforma, substituindo o trabalho manual por um gerenciamento automático e simplificado de agenda, clientes, serviços e finanças. Também oferece comprovação de presença no local do atendimento por </w:t>
+      </w:r>
+      <w:r>
+        <w:rPr>
+          <w:rFonts w:ascii="Arial" w:hAnsi="Arial" w:eastAsia="Arial" w:cs="Arial"/>
+          <w:noProof w:val="0"/>
+          <w:sz w:val="24"/>
+          <w:szCs w:val="24"/>
+          <w:lang w:val="pt-BR"/>
+        </w:rPr>
+        <w:t>geofencing</w:t>
+      </w:r>
+      <w:r>
+        <w:rPr>
+          <w:rFonts w:ascii="Arial" w:hAnsi="Arial" w:eastAsia="Arial" w:cs="Arial"/>
+          <w:noProof w:val="0"/>
+          <w:sz w:val="24"/>
+          <w:szCs w:val="24"/>
+          <w:lang w:val="pt-BR"/>
+        </w:rPr>
+        <w:t>, portal web para o cliente acompanhar suas métricas e os serviços prestados a ele, e portfólio público para divulgar o trabalho do profissional.</w:t>
       </w:r>
     </w:p>
     <w:p/>
@@ -14995,8 +15018,8 @@
       </w:pPr>
       <w:r>
         <w:rPr>
-          <w:b/>
-          <w:bCs/>
+          <w:b w:val="1"/>
+          <w:bCs w:val="1"/>
         </w:rPr>
         <w:t>Parcerias principais</w:t>
       </w:r>
@@ -15004,17 +15027,19 @@
     </w:p>
     <w:p>
       <w:pPr>
-        <w:rPr>
-          <w:bCs/>
-        </w:rPr>
-      </w:pPr>
+        <w:pStyle w:val="Normal"/>
+      </w:pPr>
+      <w:r>
+        <w:rPr>
+          <w:rFonts w:ascii="Arial" w:hAnsi="Arial" w:eastAsia="Arial" w:cs="Arial"/>
+          <w:noProof w:val="0"/>
+          <w:sz w:val="24"/>
+          <w:szCs w:val="24"/>
+          <w:lang w:val="pt-BR"/>
+        </w:rPr>
+        <w:t>FATEC Jahu (infraestrutura física e orientação técnica), trabalhadores autônomos (validação do aplicativo), empresa colaboradora Gabriel Serviços Gerais, provedores de mapas e geocodificação (monitoramento de presença por geofencing) e serviço de e-mail (envio de credenciais e recuperação de senha).</w:t>
+      </w:r>
       <w:bookmarkStart w:name="_Toc165310880" w:id="103"/>
-      <w:r>
-        <w:rPr>
-          <w:bCs/>
-        </w:rPr>
-        <w:t>Os parceiros principais são os trabalhadores autônomos</w:t>
-      </w:r>
     </w:p>
     <w:p>
       <w:pPr>
@@ -15028,51 +15053,83 @@
       </w:pPr>
       <w:r>
         <w:rPr>
+          <w:b w:val="1"/>
+          <w:bCs w:val="1"/>
+        </w:rPr>
+        <w:t>Atividades principais</w:t>
+      </w:r>
+      <w:bookmarkEnd w:id="103"/>
+    </w:p>
+    <w:p>
+      <w:pPr>
+        <w:pStyle w:val="Normal"/>
+      </w:pPr>
+      <w:r>
+        <w:rPr>
+          <w:rFonts w:ascii="Arial" w:hAnsi="Arial" w:eastAsia="Arial" w:cs="Arial"/>
+          <w:noProof w:val="0"/>
+          <w:sz w:val="24"/>
+          <w:szCs w:val="24"/>
+          <w:lang w:val="pt-BR"/>
+        </w:rPr>
+        <w:t xml:space="preserve">No aplicativo mobile, o prestador gerencia agendamentos, serviços, clientes e histórico, registra entradas e saídas, calcula lucros, gera relatórios financeiros, gera o acesso do cliente e monitora presença por </w:t>
+      </w:r>
+      <w:r>
+        <w:rPr>
+          <w:rFonts w:ascii="Arial" w:hAnsi="Arial" w:eastAsia="Arial" w:cs="Arial"/>
+          <w:noProof w:val="0"/>
+          <w:sz w:val="24"/>
+          <w:szCs w:val="24"/>
+          <w:lang w:val="pt-BR"/>
+        </w:rPr>
+        <w:t>geofencing</w:t>
+      </w:r>
+      <w:r>
+        <w:rPr>
+          <w:rFonts w:ascii="Arial" w:hAnsi="Arial" w:eastAsia="Arial" w:cs="Arial"/>
+          <w:noProof w:val="0"/>
+          <w:sz w:val="24"/>
+          <w:szCs w:val="24"/>
+          <w:lang w:val="pt-BR"/>
+        </w:rPr>
+        <w:t>. Na plataforma web, o administrador modera fotos, mantém o portfólio público e administra usuários, acessos e logs, e o cliente consulta suas métricas e os serviços prestados a ele.</w:t>
+      </w:r>
+    </w:p>
+    <w:p>
+      <w:pPr>
+        <w:rPr>
           <w:b/>
           <w:bCs/>
         </w:rPr>
-        <w:t>Atividades principais</w:t>
-      </w:r>
-      <w:bookmarkEnd w:id="103"/>
-    </w:p>
-    <w:p>
-      <w:r>
-        <w:rPr>
-          <w:rFonts w:eastAsia="Arial" w:cs="Arial"/>
+      </w:pPr>
+      <w:bookmarkStart w:name="_Toc165310881" w:id="104"/>
+      <w:r>
+        <w:rPr>
+          <w:b w:val="1"/>
+          <w:bCs w:val="1"/>
+        </w:rPr>
+        <w:t>Recursos principais</w:t>
+      </w:r>
+      <w:bookmarkEnd w:id="104"/>
+    </w:p>
+    <w:p>
+      <w:pPr>
+        <w:pStyle w:val="Normal"/>
+        <w:suppressLineNumbers w:val="0"/>
+        <w:bidi w:val="0"/>
+        <w:spacing w:before="0" w:beforeAutospacing="off" w:after="0" w:afterAutospacing="off" w:line="360" w:lineRule="auto"/>
+        <w:ind w:left="349" w:right="0" w:firstLine="709"/>
+        <w:jc w:val="both"/>
+      </w:pPr>
+      <w:r>
+        <w:rPr>
+          <w:rFonts w:ascii="Arial" w:hAnsi="Arial" w:eastAsia="Arial" w:cs="Arial"/>
+          <w:noProof w:val="0"/>
+          <w:sz w:val="24"/>
           <w:szCs w:val="24"/>
-        </w:rPr>
-        <w:t>Gerenciar os registros de serviços realizados no dia, controlar seu fluxo de caixa assim como possuir a gestão de clientes.</w:t>
-      </w:r>
-    </w:p>
-    <w:p>
-      <w:pPr>
-        <w:rPr>
-          <w:b/>
-          <w:bCs/>
-        </w:rPr>
-      </w:pPr>
-      <w:bookmarkStart w:name="_Toc165310881" w:id="104"/>
-      <w:r>
-        <w:rPr>
-          <w:b/>
-          <w:bCs/>
-        </w:rPr>
-        <w:t>Recursos principais</w:t>
-      </w:r>
-      <w:bookmarkEnd w:id="104"/>
-    </w:p>
-    <w:p>
-      <w:pPr>
-        <w:ind w:left="349"/>
-      </w:pPr>
-      <w:r>
-        <w:t xml:space="preserve">Equipe de desenvolvimento, </w:t>
-      </w:r>
-      <w:r>
-        <w:t>internet</w:t>
-      </w:r>
-      <w:r>
-        <w:t>, plataforma de hospedagem e conteúdo e informações.</w:t>
+          <w:lang w:val="pt-BR"/>
+        </w:rPr>
+        <w:t>Aplicativo mobile (prestador), plataforma web (cliente e administrador), equipe de desenvolvimento, dados de clientes, serviços, agenda e financeiro, armazenamento de fotos de serviço e serviços de geolocalização.</w:t>
       </w:r>
     </w:p>
     <w:p>
@@ -15104,25 +15161,68 @@
       <w:bookmarkStart w:name="_Toc165310883" w:id="108"/>
       <w:r>
         <w:rPr>
+          <w:b w:val="1"/>
+          <w:bCs w:val="1"/>
+        </w:rPr>
+        <w:t>Relacionamento Com Clientes</w:t>
+      </w:r>
+      <w:bookmarkEnd w:id="108"/>
+    </w:p>
+    <w:p>
+      <w:pPr>
+        <w:pStyle w:val="Normal"/>
+        <w:suppressLineNumbers w:val="0"/>
+        <w:bidi w:val="0"/>
+        <w:spacing w:before="0" w:beforeAutospacing="off" w:after="0" w:afterAutospacing="off" w:line="360" w:lineRule="auto"/>
+        <w:ind w:left="0" w:right="0" w:firstLine="709"/>
+        <w:jc w:val="both"/>
+      </w:pPr>
+      <w:r>
+        <w:rPr>
+          <w:rFonts w:ascii="Arial" w:hAnsi="Arial" w:eastAsia="Arial" w:cs="Arial"/>
+          <w:noProof w:val="0"/>
+          <w:sz w:val="24"/>
+          <w:szCs w:val="24"/>
+          <w:lang w:val="pt-BR"/>
+        </w:rPr>
+        <w:t>Suporte ao usuário, aprendizado prático no uso da plataforma e 7 dias grátis para novos usuários.</w:t>
+      </w:r>
+      <w:bookmarkStart w:name="_Toc165310884" w:id="109"/>
+    </w:p>
+    <w:p>
+      <w:pPr>
+        <w:rPr>
           <w:b/>
           <w:bCs/>
         </w:rPr>
-        <w:t>Relacionamento Com Clientes</w:t>
-      </w:r>
-      <w:bookmarkEnd w:id="108"/>
-    </w:p>
-    <w:p>
-      <w:pPr>
-        <w:rPr>
-          <w:bCs/>
-        </w:rPr>
-      </w:pPr>
-      <w:bookmarkStart w:name="_Toc165310884" w:id="109"/>
-      <w:r>
-        <w:rPr>
-          <w:bCs/>
-        </w:rPr>
-        <w:t>Analisar e criar o projeto junto com o usuário final, suporte humanizado e aprendizado prático</w:t>
+      </w:pPr>
+      <w:r>
+        <w:rPr>
+          <w:b w:val="1"/>
+          <w:bCs w:val="1"/>
+        </w:rPr>
+        <w:t>Canais</w:t>
+      </w:r>
+      <w:bookmarkEnd w:id="109"/>
+    </w:p>
+    <w:p>
+      <w:pPr>
+        <w:pStyle w:val="Normal"/>
+        <w:suppressLineNumbers w:val="0"/>
+        <w:bidi w:val="0"/>
+        <w:spacing w:before="0" w:beforeAutospacing="off" w:after="0" w:afterAutospacing="off" w:line="360" w:lineRule="auto"/>
+        <w:ind w:left="0" w:right="0" w:firstLine="709"/>
+        <w:jc w:val="both"/>
+      </w:pPr>
+      <w:r>
+        <w:rPr>
+          <w:rFonts w:ascii="Arial" w:hAnsi="Arial" w:eastAsia="Arial" w:cs="Arial"/>
+          <w:noProof w:val="0"/>
+          <w:sz w:val="24"/>
+          <w:szCs w:val="24"/>
+          <w:lang w:val="pt-BR"/>
+        </w:rPr>
+        <w:t>Aplicativo mobile (prestador), plataforma web (cliente e administrador), portfólio público, parcerias locais e recomendações pessoais.</w:t>
       </w:r>
     </w:p>
     <w:p>
@@ -15132,38 +15232,11 @@
           <w:bCs/>
         </w:rPr>
       </w:pPr>
-      <w:r>
-        <w:rPr>
-          <w:b/>
-          <w:bCs/>
-        </w:rPr>
-        <w:t>Canais</w:t>
-      </w:r>
-      <w:bookmarkEnd w:id="109"/>
-    </w:p>
-    <w:p>
-      <w:r>
-        <w:t xml:space="preserve">Aplicativo, </w:t>
-      </w:r>
-      <w:r>
-        <w:t>parcerias locais e recomendações pessoais</w:t>
-      </w:r>
-      <w:r>
-        <w:t>.</w:t>
-      </w:r>
-    </w:p>
-    <w:p>
-      <w:pPr>
-        <w:rPr>
-          <w:b/>
-          <w:bCs/>
-        </w:rPr>
-      </w:pPr>
       <w:bookmarkStart w:name="_Toc165310885" w:id="110"/>
       <w:r>
         <w:rPr>
-          <w:b/>
-          <w:bCs/>
+          <w:b w:val="1"/>
+          <w:bCs w:val="1"/>
         </w:rPr>
         <w:t>Segmento de Clientes</w:t>
       </w:r>
@@ -15171,18 +15244,25 @@
     </w:p>
     <w:p>
       <w:pPr>
-        <w:rPr>
-          <w:bCs/>
-        </w:rPr>
-      </w:pPr>
+        <w:pStyle w:val="Normal"/>
+        <w:suppressLineNumbers w:val="0"/>
+        <w:bidi w:val="0"/>
+        <w:spacing w:before="0" w:beforeAutospacing="off" w:after="0" w:afterAutospacing="off" w:line="360" w:lineRule="auto"/>
+        <w:ind w:left="0" w:right="0" w:firstLine="709"/>
+        <w:jc w:val="both"/>
+      </w:pPr>
+      <w:r>
+        <w:rPr>
+          <w:rFonts w:ascii="Arial" w:hAnsi="Arial" w:eastAsia="Arial" w:cs="Arial"/>
+          <w:noProof w:val="0"/>
+          <w:sz w:val="24"/>
+          <w:szCs w:val="24"/>
+          <w:lang w:val="pt-BR"/>
+        </w:rPr>
+        <w:t>Profissionais autônomos que precisam organizar agenda, clientes, serviços e registros financeiros, e que desejam acompanhar pagamentos, lucros e histórico de atendimentos. Também fazem parte os clientes desses profissionais, que acompanham métricas e serviços pelo portal web, e os administradores da plataforma, responsáveis por usuários, logs e aprovação de fotos.</w:t>
+      </w:r>
       <w:bookmarkStart w:name="_Toc182927350" w:id="111"/>
       <w:bookmarkStart w:name="_Toc207256970" w:id="112"/>
-      <w:r>
-        <w:rPr>
-          <w:bCs/>
-        </w:rPr>
-        <w:t>Autônomos locais que não possuem meios automáticos de gerenciar seus serviços</w:t>
-      </w:r>
     </w:p>
     <w:p>
       <w:pPr>
@@ -15213,65 +15293,99 @@
       <w:bookmarkStart w:name="_Toc165310886" w:id="114"/>
       <w:r>
         <w:rPr>
-          <w:b/>
-          <w:bCs/>
+          <w:b w:val="1"/>
+          <w:bCs w:val="1"/>
         </w:rPr>
         <w:t>Estrutura de Custo</w:t>
       </w:r>
       <w:bookmarkEnd w:id="114"/>
     </w:p>
     <w:p>
+      <w:pPr>
+        <w:pStyle w:val="Normal"/>
+        <w:suppressLineNumbers w:val="0"/>
+        <w:bidi w:val="0"/>
+        <w:spacing w:before="0" w:beforeAutospacing="off" w:after="0" w:afterAutospacing="off" w:line="360" w:lineRule="auto"/>
+        <w:ind w:left="0" w:right="0" w:firstLine="709"/>
+        <w:jc w:val="both"/>
+      </w:pPr>
+      <w:r>
+        <w:rPr>
+          <w:rFonts w:ascii="Arial" w:hAnsi="Arial" w:eastAsia="Arial" w:cs="Arial"/>
+          <w:noProof w:val="0"/>
+          <w:sz w:val="24"/>
+          <w:szCs w:val="24"/>
+          <w:lang w:val="pt-BR"/>
+        </w:rPr>
+        <w:t>Desenvolvimento e manutenção do aplicativo mobile</w:t>
+      </w:r>
+      <w:r>
+        <w:rPr>
+          <w:rFonts w:ascii="Arial" w:hAnsi="Arial" w:eastAsia="Arial" w:cs="Arial"/>
+          <w:noProof w:val="0"/>
+          <w:sz w:val="24"/>
+          <w:szCs w:val="24"/>
+          <w:lang w:val="pt-BR"/>
+        </w:rPr>
+        <w:t xml:space="preserve"> e da plataforma web, infraestrutura e serviços necessários ao sistema (hospedagem, armazenamento de fotos, e-mail e geocodificação), suporte, atualização e divulgação.</w:t>
+      </w:r>
       <w:bookmarkStart w:name="_Toc165310887" w:id="115"/>
-      <w:r>
-        <w:t>A estrutura de custos contempla o desenvolvimento e o uso de ferramentas de desenvolvimento, além dos gastos com infraestrutura, incluindo servidores, banco de dados e serviços em nuvem. Também abrange os custos de manutenção e suporte contínuo, a publicação do aplicativo nas plataformas digitais e os investimentos em divulgação para alcançar e engajar os usuários.</w:t>
-      </w:r>
-    </w:p>
-    <w:p>
-      <w:pPr>
-        <w:widowControl/>
+    </w:p>
+    <w:p>
+      <w:pPr>
+        <w:pStyle w:val="Normal"/>
+        <w:widowControl w:val="1"/>
         <w:spacing w:line="240" w:lineRule="auto"/>
-        <w:ind w:firstLine="0"/>
+        <w:ind w:firstLine="708"/>
         <w:jc w:val="left"/>
         <w:rPr>
-          <w:b/>
-          <w:bCs/>
-        </w:rPr>
-      </w:pPr>
-      <w:r>
-        <w:rPr>
-          <w:b/>
-          <w:bCs/>
-        </w:rPr>
-        <w:br w:type="page"/>
-      </w:r>
-    </w:p>
-    <w:p>
-      <w:pPr>
-        <w:widowControl/>
-        <w:spacing w:line="240" w:lineRule="auto"/>
-        <w:ind w:firstLine="0"/>
-        <w:jc w:val="left"/>
-        <w:rPr>
-          <w:b/>
-          <w:bCs/>
-        </w:rPr>
-      </w:pPr>
-      <w:r>
-        <w:rPr>
-          <w:b/>
-          <w:bCs/>
-        </w:rPr>
-        <w:lastRenderedPageBreak/>
+          <w:b w:val="1"/>
+          <w:bCs w:val="1"/>
+        </w:rPr>
+      </w:pPr>
+      <w:r>
+        <w:rPr>
+          <w:b w:val="1"/>
+          <w:bCs w:val="1"/>
+        </w:rPr>
         <w:t>Fontes de Receita</w:t>
       </w:r>
       <w:bookmarkEnd w:id="115"/>
     </w:p>
     <w:p>
       <w:pPr>
-        <w:ind w:firstLine="432"/>
-      </w:pPr>
-      <w:r>
-        <w:t>A estrutura de receitas é baseada em assinaturas mensais, que garantem aos usuários acesso às funcionalidades completas do aplicativo. Entre as opções, destacam-se os planos Premium, que oferecem uma experiência sem anúncios, além de recursos adicionais, como a exportação de relatórios em formato PDF.</w:t>
+        <w:pStyle w:val="Normal"/>
+        <w:ind w:firstLine="708"/>
+      </w:pPr>
+      <w:r>
+        <w:rPr>
+          <w:rFonts w:ascii="Arial" w:hAnsi="Arial" w:eastAsia="Arial" w:cs="Arial"/>
+          <w:noProof w:val="0"/>
+          <w:sz w:val="24"/>
+          <w:szCs w:val="24"/>
+          <w:lang w:val="pt-BR"/>
+        </w:rPr>
+        <w:t xml:space="preserve">Assinaturas mensais divididas em três planos. O plano Básico (R$ 9,90) inclui criar, editar e cancelar agendamentos, visualizar agenda, cadastrar clientes, histórico de clientes, cadastrar tipos de serviço e perfil do profissional. O plano Profissional (R$ 19,90) inclui tudo do Básico, além de entradas e saídas financeiras, cálculo de lucro e lucro geral, relatórios financeiros e métricas do prestador. O plano Full (R$ 29,90) inclui tudo do Profissional, além de portfólio público, upload de fotos dos serviços, área do cliente com métricas, geolocalização e </w:t>
+      </w:r>
+      <w:r>
+        <w:rPr>
+          <w:rFonts w:ascii="Arial" w:hAnsi="Arial" w:eastAsia="Arial" w:cs="Arial"/>
+          <w:noProof w:val="0"/>
+          <w:sz w:val="24"/>
+          <w:szCs w:val="24"/>
+          <w:lang w:val="pt-BR"/>
+        </w:rPr>
+        <w:t>geofencing</w:t>
+      </w:r>
+      <w:r>
+        <w:rPr>
+          <w:rFonts w:ascii="Arial" w:hAnsi="Arial" w:eastAsia="Arial" w:cs="Arial"/>
+          <w:noProof w:val="0"/>
+          <w:sz w:val="24"/>
+          <w:szCs w:val="24"/>
+          <w:lang w:val="pt-BR"/>
+        </w:rPr>
+        <w:t>. Novos usuários ganham 7 dias grátis no plano Full para testar todos os recursos da plataforma antes de escolher o plano ideal.</w:t>
       </w:r>
     </w:p>
     <w:p>

</xml_diff>

<commit_message>
atualizando diagrama de classes
</commit_message>
<xml_diff>
--- a/DayPlannio.docx
+++ b/DayPlannio.docx
@@ -13083,9 +13083,9 @@
           <w:lang w:val="pt-BR"/>
         </w:rPr>
       </w:pPr>
-      <w:bookmarkStart w:id="12" w:name="_Toc331506323"/>
-      <w:bookmarkStart w:id="13" w:name="_Toc331507631"/>
-      <w:bookmarkStart w:id="14" w:name="_Toc244087441"/>
+      <w:bookmarkStart w:id="12" w:name="_Toc244087441"/>
+      <w:bookmarkStart w:id="13" w:name="_Toc331506323"/>
+      <w:bookmarkStart w:id="14" w:name="_Toc331507631"/>
       <w:r>
         <w:rPr>
           <w:lang w:val="pt-BR"/>
@@ -13093,7 +13093,7 @@
         <w:lastRenderedPageBreak/>
         <w:t>Documento de Requisitos</w:t>
       </w:r>
-      <w:bookmarkEnd w:id="14"/>
+      <w:bookmarkEnd w:id="12"/>
     </w:p>
     <w:p>
       <w:r>
@@ -15269,8 +15269,8 @@
           <w:noProof/>
         </w:rPr>
         <w:drawing>
-          <wp:inline distT="0" distB="0" distL="0" distR="0" wp14:anchorId="41D134C0" wp14:editId="25A9F10B">
-            <wp:extent cx="5760000" cy="5868387"/>
+          <wp:inline distT="0" distB="0" distL="0" distR="0" wp14:anchorId="41D134C0" wp14:editId="40487423">
+            <wp:extent cx="5759999" cy="5868387"/>
             <wp:effectExtent l="0" t="0" r="0" b="0"/>
             <wp:docPr id="1231729242" name="drawing"/>
             <wp:cNvGraphicFramePr>
@@ -15298,7 +15298,7 @@
                   <pic:spPr>
                     <a:xfrm>
                       <a:off x="0" y="0"/>
-                      <a:ext cx="5760000" cy="5868387"/>
+                      <a:ext cx="5759999" cy="5868387"/>
                     </a:xfrm>
                     <a:prstGeom prst="rect">
                       <a:avLst/>
@@ -15501,14 +15501,14 @@
       </w:pPr>
       <w:bookmarkStart w:id="120" w:name="_Toc182927347"/>
       <w:bookmarkStart w:id="121" w:name="_Toc1999012226"/>
-      <w:bookmarkStart w:id="122" w:name="_Toc165310879"/>
-      <w:bookmarkStart w:id="123" w:name="_Toc244087506"/>
+      <w:bookmarkStart w:id="122" w:name="_Toc244087506"/>
+      <w:bookmarkStart w:id="123" w:name="_Toc165310879"/>
       <w:r>
         <w:t>O que será elaborado?</w:t>
       </w:r>
       <w:bookmarkEnd w:id="120"/>
       <w:bookmarkEnd w:id="121"/>
-      <w:bookmarkEnd w:id="123"/>
+      <w:bookmarkEnd w:id="122"/>
     </w:p>
     <w:p>
       <w:pPr>
@@ -15590,7 +15590,7 @@
         </w:rPr>
         <w:t>Parcerias principais</w:t>
       </w:r>
-      <w:bookmarkEnd w:id="122"/>
+      <w:bookmarkEnd w:id="123"/>
     </w:p>
     <w:p>
       <w:r>
@@ -17167,16 +17167,16 @@
       <w:pPr>
         <w:pStyle w:val="Ttulo1"/>
       </w:pPr>
-      <w:bookmarkStart w:id="156" w:name="_Toc165310889"/>
-      <w:bookmarkStart w:id="157" w:name="_Toc182927351"/>
-      <w:bookmarkStart w:id="158" w:name="_Toc1662712195"/>
-      <w:bookmarkStart w:id="159" w:name="_Toc244087516"/>
+      <w:bookmarkStart w:id="156" w:name="_Toc244087516"/>
+      <w:bookmarkStart w:id="157" w:name="_Toc165310889"/>
+      <w:bookmarkStart w:id="158" w:name="_Toc182927351"/>
+      <w:bookmarkStart w:id="159" w:name="_Toc1662712195"/>
       <w:bookmarkEnd w:id="89"/>
       <w:r>
         <w:lastRenderedPageBreak/>
         <w:t>Modelo de dados</w:t>
       </w:r>
-      <w:bookmarkEnd w:id="159"/>
+      <w:bookmarkEnd w:id="156"/>
     </w:p>
     <w:p>
       <w:pPr>
@@ -17605,9 +17605,9 @@
       <w:r>
         <w:t>Design</w:t>
       </w:r>
-      <w:bookmarkEnd w:id="156"/>
       <w:bookmarkEnd w:id="157"/>
       <w:bookmarkEnd w:id="158"/>
+      <w:bookmarkEnd w:id="159"/>
       <w:bookmarkEnd w:id="169"/>
     </w:p>
     <w:p>
@@ -17656,20 +17656,20 @@
       </w:pPr>
       <w:bookmarkStart w:id="170" w:name="_Toc211596448"/>
       <w:bookmarkStart w:id="171" w:name="_Toc214534061"/>
-      <w:bookmarkStart w:id="172" w:name="_Toc182897094"/>
-      <w:bookmarkStart w:id="173" w:name="_Toc213311258"/>
-      <w:bookmarkStart w:id="174" w:name="_Toc213311338"/>
-      <w:bookmarkStart w:id="175" w:name="_Toc213311377"/>
-      <w:bookmarkStart w:id="176" w:name="_Toc213311442"/>
-      <w:bookmarkStart w:id="177" w:name="_Toc213311521"/>
-      <w:bookmarkStart w:id="178" w:name="_Toc213311564"/>
-      <w:bookmarkStart w:id="179" w:name="_Toc213311623"/>
-      <w:bookmarkStart w:id="180" w:name="_Toc213311846"/>
-      <w:bookmarkStart w:id="181" w:name="_Toc213311925"/>
-      <w:bookmarkStart w:id="182" w:name="_Toc213647694"/>
-      <w:bookmarkStart w:id="183" w:name="_Toc213665798"/>
-      <w:bookmarkStart w:id="184" w:name="_Toc213665837"/>
-      <w:bookmarkStart w:id="185" w:name="_Toc244087521"/>
+      <w:bookmarkStart w:id="172" w:name="_Toc244087521"/>
+      <w:bookmarkStart w:id="173" w:name="_Toc182897094"/>
+      <w:bookmarkStart w:id="174" w:name="_Toc213311258"/>
+      <w:bookmarkStart w:id="175" w:name="_Toc213311338"/>
+      <w:bookmarkStart w:id="176" w:name="_Toc213311377"/>
+      <w:bookmarkStart w:id="177" w:name="_Toc213311442"/>
+      <w:bookmarkStart w:id="178" w:name="_Toc213311521"/>
+      <w:bookmarkStart w:id="179" w:name="_Toc213311564"/>
+      <w:bookmarkStart w:id="180" w:name="_Toc213311623"/>
+      <w:bookmarkStart w:id="181" w:name="_Toc213311846"/>
+      <w:bookmarkStart w:id="182" w:name="_Toc213311925"/>
+      <w:bookmarkStart w:id="183" w:name="_Toc213647694"/>
+      <w:bookmarkStart w:id="184" w:name="_Toc213665798"/>
+      <w:bookmarkStart w:id="185" w:name="_Toc213665837"/>
       <w:r>
         <w:t xml:space="preserve">Paleta de </w:t>
       </w:r>
@@ -17678,7 +17678,7 @@
         <w:t>cores</w:t>
       </w:r>
       <w:bookmarkEnd w:id="171"/>
-      <w:bookmarkEnd w:id="185"/>
+      <w:bookmarkEnd w:id="172"/>
     </w:p>
     <w:p>
       <w:pPr>
@@ -17734,7 +17734,6 @@
       <w:r>
         <w:t>- Paleta de Cores</w:t>
       </w:r>
-      <w:bookmarkEnd w:id="172"/>
       <w:bookmarkEnd w:id="173"/>
       <w:bookmarkEnd w:id="174"/>
       <w:bookmarkEnd w:id="175"/>
@@ -17747,6 +17746,7 @@
       <w:bookmarkEnd w:id="182"/>
       <w:bookmarkEnd w:id="183"/>
       <w:bookmarkEnd w:id="184"/>
+      <w:bookmarkEnd w:id="185"/>
       <w:bookmarkEnd w:id="186"/>
     </w:p>
     <w:p>
@@ -18166,7 +18166,7 @@
           <w:noProof/>
         </w:rPr>
         <w:drawing>
-          <wp:inline distT="0" distB="0" distL="0" distR="0" wp14:anchorId="053FF6AA" wp14:editId="61D715F7">
+          <wp:inline distT="0" distB="0" distL="0" distR="0" wp14:anchorId="053FF6AA" wp14:editId="4BBD829C">
             <wp:extent cx="3137132" cy="582749"/>
             <wp:effectExtent l="0" t="0" r="6350" b="8255"/>
             <wp:docPr id="1" name="Imagem 1"/>
@@ -19014,7 +19014,7 @@
           <w:noProof/>
         </w:rPr>
         <w:drawing>
-          <wp:inline distT="0" distB="0" distL="0" distR="0" wp14:anchorId="62C25E32" wp14:editId="64887400">
+          <wp:inline distT="0" distB="0" distL="0" distR="0" wp14:anchorId="62C25E32" wp14:editId="17F2769F">
             <wp:extent cx="1683385" cy="3582868"/>
             <wp:effectExtent l="0" t="0" r="0" b="0"/>
             <wp:docPr id="2" name="Imagem 2"/>
@@ -19187,7 +19187,7 @@
           <w:noProof/>
         </w:rPr>
         <w:drawing>
-          <wp:inline distT="0" distB="0" distL="0" distR="0" wp14:anchorId="5EDA7722" wp14:editId="04059096">
+          <wp:inline distT="0" distB="0" distL="0" distR="0" wp14:anchorId="5EDA7722" wp14:editId="61125923">
             <wp:extent cx="1680021" cy="3328263"/>
             <wp:effectExtent l="0" t="0" r="0" b="5715"/>
             <wp:docPr id="4" name="Imagem 4"/>
@@ -19973,8 +19973,8 @@
         </w:rPr>
       </w:pPr>
     </w:p>
-    <w:bookmarkEnd w:id="12"/>
     <w:bookmarkEnd w:id="13"/>
+    <w:bookmarkEnd w:id="14"/>
     <w:bookmarkEnd w:id="240"/>
     <w:p>
       <w:pPr>
@@ -20072,7 +20072,7 @@
           <w:noProof/>
         </w:rPr>
         <w:drawing>
-          <wp:inline distT="0" distB="0" distL="0" distR="0" wp14:anchorId="2CB3C094" wp14:editId="16D8536F">
+          <wp:inline distT="0" distB="0" distL="0" distR="0" wp14:anchorId="2CB3C094" wp14:editId="5FA1E671">
             <wp:extent cx="1800000" cy="3679200"/>
             <wp:effectExtent l="0" t="0" r="0" b="0"/>
             <wp:docPr id="6" name="Imagem 6"/>
@@ -20239,7 +20239,7 @@
           <w:noProof/>
         </w:rPr>
         <w:drawing>
-          <wp:inline distT="0" distB="0" distL="0" distR="0" wp14:anchorId="5A120775" wp14:editId="3085C4B6">
+          <wp:inline distT="0" distB="0" distL="0" distR="0" wp14:anchorId="5A120775" wp14:editId="67A5D323">
             <wp:extent cx="1800000" cy="3661200"/>
             <wp:effectExtent l="0" t="0" r="0" b="0"/>
             <wp:docPr id="13" name="Imagem 13"/>
@@ -20400,7 +20400,7 @@
           <w:noProof/>
         </w:rPr>
         <w:drawing>
-          <wp:inline distT="0" distB="0" distL="0" distR="0" wp14:anchorId="08BAB9EB" wp14:editId="2D3049A3">
+          <wp:inline distT="0" distB="0" distL="0" distR="0" wp14:anchorId="08BAB9EB" wp14:editId="604C3BFA">
             <wp:extent cx="1718643" cy="3485408"/>
             <wp:effectExtent l="0" t="0" r="0" b="1270"/>
             <wp:docPr id="14" name="Imagem 14"/>
@@ -20543,7 +20543,7 @@
           <w:noProof/>
         </w:rPr>
         <w:drawing>
-          <wp:inline distT="0" distB="0" distL="0" distR="0" wp14:anchorId="16755319" wp14:editId="5C867480">
+          <wp:inline distT="0" distB="0" distL="0" distR="0" wp14:anchorId="16755319" wp14:editId="46986AF6">
             <wp:extent cx="1800000" cy="3643200"/>
             <wp:effectExtent l="0" t="0" r="0" b="0"/>
             <wp:docPr id="38" name="Imagem 38"/>
@@ -20691,7 +20691,7 @@
           <w:noProof/>
         </w:rPr>
         <w:drawing>
-          <wp:inline distT="0" distB="0" distL="0" distR="0" wp14:anchorId="6A971DAB" wp14:editId="0B587B7F">
+          <wp:inline distT="0" distB="0" distL="0" distR="0" wp14:anchorId="6A971DAB" wp14:editId="50040DF6">
             <wp:extent cx="1800000" cy="3643200"/>
             <wp:effectExtent l="0" t="0" r="0" b="0"/>
             <wp:docPr id="39" name="Imagem 39"/>
@@ -20837,7 +20837,7 @@
           <w:noProof/>
         </w:rPr>
         <w:drawing>
-          <wp:inline distT="0" distB="0" distL="0" distR="0" wp14:anchorId="607E63F6" wp14:editId="7307BFDD">
+          <wp:inline distT="0" distB="0" distL="0" distR="0" wp14:anchorId="607E63F6" wp14:editId="50365913">
             <wp:extent cx="1800000" cy="3650400"/>
             <wp:effectExtent l="0" t="0" r="0" b="7620"/>
             <wp:docPr id="40" name="Imagem 40"/>
@@ -21291,7 +21291,7 @@
           <w:sz w:val="20"/>
         </w:rPr>
         <w:drawing>
-          <wp:inline distT="0" distB="0" distL="0" distR="0" wp14:anchorId="26910C99" wp14:editId="724598E7">
+          <wp:inline distT="0" distB="0" distL="0" distR="0" wp14:anchorId="26910C99" wp14:editId="5ABE43A8">
             <wp:extent cx="1800000" cy="3675600"/>
             <wp:effectExtent l="0" t="0" r="0" b="1270"/>
             <wp:docPr id="42" name="Imagem 42"/>
@@ -21433,7 +21433,7 @@
           <w:noProof/>
         </w:rPr>
         <w:drawing>
-          <wp:inline distT="0" distB="0" distL="0" distR="0" wp14:anchorId="06EA6653" wp14:editId="146498C6">
+          <wp:inline distT="0" distB="0" distL="0" distR="0" wp14:anchorId="06EA6653" wp14:editId="6C0A1B17">
             <wp:extent cx="1800000" cy="3708000"/>
             <wp:effectExtent l="0" t="0" r="0" b="6985"/>
             <wp:docPr id="43" name="Imagem 43"/>
@@ -21585,7 +21585,7 @@
           <w:sz w:val="20"/>
         </w:rPr>
         <w:drawing>
-          <wp:inline distT="0" distB="0" distL="0" distR="0" wp14:anchorId="7F85AC6E" wp14:editId="6EF3A743">
+          <wp:inline distT="0" distB="0" distL="0" distR="0" wp14:anchorId="7F85AC6E" wp14:editId="62478019">
             <wp:extent cx="1689462" cy="3473533"/>
             <wp:effectExtent l="0" t="0" r="6350" b="0"/>
             <wp:docPr id="44" name="Imagem 44"/>
@@ -21727,7 +21727,7 @@
           <w:noProof/>
         </w:rPr>
         <w:drawing>
-          <wp:inline distT="0" distB="0" distL="0" distR="0" wp14:anchorId="5E247610" wp14:editId="28F8E19A">
+          <wp:inline distT="0" distB="0" distL="0" distR="0" wp14:anchorId="5E247610" wp14:editId="4745F7FD">
             <wp:extent cx="1800000" cy="3682800"/>
             <wp:effectExtent l="0" t="0" r="0" b="0"/>
             <wp:docPr id="45" name="Imagem 45"/>
@@ -21871,7 +21871,7 @@
           <w:noProof/>
         </w:rPr>
         <w:drawing>
-          <wp:inline distT="0" distB="0" distL="0" distR="0" wp14:anchorId="3C793622" wp14:editId="25221E80">
+          <wp:inline distT="0" distB="0" distL="0" distR="0" wp14:anchorId="3C793622" wp14:editId="64E52EEC">
             <wp:extent cx="1800000" cy="3682800"/>
             <wp:effectExtent l="0" t="0" r="0" b="0"/>
             <wp:docPr id="46" name="Imagem 46"/>
@@ -22000,7 +22000,7 @@
           <w:noProof/>
         </w:rPr>
         <w:drawing>
-          <wp:inline distT="0" distB="0" distL="0" distR="0" wp14:anchorId="02BD1645" wp14:editId="452B31CB">
+          <wp:inline distT="0" distB="0" distL="0" distR="0" wp14:anchorId="02BD1645" wp14:editId="1492F59C">
             <wp:extent cx="1800000" cy="3704400"/>
             <wp:effectExtent l="0" t="0" r="0" b="0"/>
             <wp:docPr id="47" name="Imagem 47"/>
@@ -22292,7 +22292,7 @@
           <w:noProof/>
         </w:rPr>
         <w:drawing>
-          <wp:inline distT="0" distB="0" distL="0" distR="0" wp14:anchorId="4CBE5942" wp14:editId="3A540AB2">
+          <wp:inline distT="0" distB="0" distL="0" distR="0" wp14:anchorId="4CBE5942" wp14:editId="79783B96">
             <wp:extent cx="1760220" cy="3627973"/>
             <wp:effectExtent l="0" t="0" r="0" b="0"/>
             <wp:docPr id="49" name="Imagem 49"/>
@@ -22450,7 +22450,7 @@
           <w:sz w:val="20"/>
         </w:rPr>
         <w:drawing>
-          <wp:inline distT="0" distB="0" distL="0" distR="0" wp14:anchorId="202DE3E8" wp14:editId="56F61A19">
+          <wp:inline distT="0" distB="0" distL="0" distR="0" wp14:anchorId="202DE3E8" wp14:editId="09CF86EF">
             <wp:extent cx="1800000" cy="3664800"/>
             <wp:effectExtent l="0" t="0" r="0" b="0"/>
             <wp:docPr id="50" name="Imagem 50"/>
@@ -22744,7 +22744,7 @@
           <w:noProof/>
         </w:rPr>
         <w:drawing>
-          <wp:inline distT="0" distB="0" distL="0" distR="0" wp14:anchorId="4F90F432" wp14:editId="22133C1E">
+          <wp:inline distT="0" distB="0" distL="0" distR="0" wp14:anchorId="4F90F432" wp14:editId="271FCB85">
             <wp:extent cx="1800000" cy="3661200"/>
             <wp:effectExtent l="0" t="0" r="0" b="0"/>
             <wp:docPr id="51" name="Imagem 51"/>
@@ -22905,7 +22905,7 @@
           <w:noProof/>
         </w:rPr>
         <w:drawing>
-          <wp:inline distT="0" distB="0" distL="0" distR="0" wp14:anchorId="5EA008A2" wp14:editId="18F24A25">
+          <wp:inline distT="0" distB="0" distL="0" distR="0" wp14:anchorId="5EA008A2" wp14:editId="4C10447A">
             <wp:extent cx="1800000" cy="3682800"/>
             <wp:effectExtent l="0" t="0" r="0" b="0"/>
             <wp:docPr id="52" name="Imagem 52"/>
@@ -23053,7 +23053,7 @@
           <w:noProof/>
         </w:rPr>
         <w:drawing>
-          <wp:inline distT="0" distB="0" distL="0" distR="0" wp14:anchorId="10F46BB5" wp14:editId="0E882B50">
+          <wp:inline distT="0" distB="0" distL="0" distR="0" wp14:anchorId="10F46BB5" wp14:editId="652EB630">
             <wp:extent cx="1800000" cy="3650400"/>
             <wp:effectExtent l="0" t="0" r="0" b="7620"/>
             <wp:docPr id="53" name="Imagem 53"/>
@@ -23194,7 +23194,7 @@
           <w:noProof/>
         </w:rPr>
         <w:drawing>
-          <wp:inline distT="0" distB="0" distL="0" distR="0" wp14:anchorId="6C47DC88" wp14:editId="6EB77173">
+          <wp:inline distT="0" distB="0" distL="0" distR="0" wp14:anchorId="6C47DC88" wp14:editId="082DEECC">
             <wp:extent cx="1800000" cy="3679200"/>
             <wp:effectExtent l="0" t="0" r="0" b="0"/>
             <wp:docPr id="55" name="Imagem 55"/>
@@ -23342,7 +23342,7 @@
           <w:noProof/>
         </w:rPr>
         <w:drawing>
-          <wp:inline distT="0" distB="0" distL="0" distR="0" wp14:anchorId="294B5823" wp14:editId="6FF39567">
+          <wp:inline distT="0" distB="0" distL="0" distR="0" wp14:anchorId="294B5823" wp14:editId="7819931E">
             <wp:extent cx="1800000" cy="3668400"/>
             <wp:effectExtent l="0" t="0" r="0" b="8255"/>
             <wp:docPr id="54" name="Imagem 54"/>
@@ -23483,7 +23483,7 @@
           <w:noProof/>
         </w:rPr>
         <w:drawing>
-          <wp:inline distT="0" distB="0" distL="0" distR="0" wp14:anchorId="53FC4771" wp14:editId="22E2C02F">
+          <wp:inline distT="0" distB="0" distL="0" distR="0" wp14:anchorId="53FC4771" wp14:editId="21453BF3">
             <wp:extent cx="1800000" cy="3682800"/>
             <wp:effectExtent l="0" t="0" r="0" b="0"/>
             <wp:docPr id="56" name="Imagem 56"/>
@@ -23643,7 +23643,7 @@
           <w:noProof/>
         </w:rPr>
         <w:drawing>
-          <wp:inline distT="0" distB="0" distL="0" distR="0" wp14:anchorId="7FE45B35" wp14:editId="2CD92EBC">
+          <wp:inline distT="0" distB="0" distL="0" distR="0" wp14:anchorId="7FE45B35" wp14:editId="412AC7F1">
             <wp:extent cx="1800000" cy="3578400"/>
             <wp:effectExtent l="0" t="0" r="0" b="3175"/>
             <wp:docPr id="23" name="Imagem 23" descr="D:\aplicacaoo\meu_perfil.PNG"/>
@@ -24168,7 +24168,7 @@
           <w:noProof/>
         </w:rPr>
         <w:drawing>
-          <wp:anchor distT="0" distB="0" distL="114300" distR="114300" simplePos="0" relativeHeight="251660288" behindDoc="0" locked="0" layoutInCell="1" allowOverlap="1" wp14:anchorId="570F8FD9" wp14:editId="2DD05853">
+          <wp:anchor distT="0" distB="0" distL="114300" distR="114300" simplePos="0" relativeHeight="251660288" behindDoc="0" locked="0" layoutInCell="1" allowOverlap="1" wp14:anchorId="570F8FD9" wp14:editId="2CCFF65B">
             <wp:simplePos x="0" y="0"/>
             <wp:positionH relativeFrom="margin">
               <wp:align>center</wp:align>
@@ -30739,6 +30739,19 @@
 </file>
 
 <file path=customXml/item1.xml><?xml version="1.0" encoding="utf-8"?>
+<b:Sources xmlns:b="http://schemas.openxmlformats.org/officeDocument/2006/bibliography" xmlns="http://schemas.openxmlformats.org/officeDocument/2006/bibliography" SelectedStyle="\APA.XSL" StyleName="APA"/>
+</file>
+
+<file path=customXml/item2.xml><?xml version="1.0" encoding="utf-8"?>
+<?mso-contentType ?>
+<FormTemplates xmlns="http://schemas.microsoft.com/sharepoint/v3/contenttype/forms">
+  <Display>DocumentLibraryForm</Display>
+  <Edit>DocumentLibraryForm</Edit>
+  <New>DocumentLibraryForm</New>
+</FormTemplates>
+</file>
+
+<file path=customXml/item3.xml><?xml version="1.0" encoding="utf-8"?>
 <p:properties xmlns:p="http://schemas.microsoft.com/office/2006/metadata/properties" xmlns:xsi="http://www.w3.org/2001/XMLSchema-instance" xmlns:pc="http://schemas.microsoft.com/office/infopath/2007/PartnerControls">
   <documentManagement>
     <lcf76f155ced4ddcb4097134ff3c332f xmlns="73616d7f-17b8-4c43-aa5e-25ef7e462a18">
@@ -30747,19 +30760,6 @@
     <TaxCatchAll xmlns="686b96b7-37ef-4e5c-bc3c-4e780f33c780" xsi:nil="true"/>
   </documentManagement>
 </p:properties>
-</file>
-
-<file path=customXml/item2.xml><?xml version="1.0" encoding="utf-8"?>
-<b:Sources xmlns:b="http://schemas.openxmlformats.org/officeDocument/2006/bibliography" xmlns="http://schemas.openxmlformats.org/officeDocument/2006/bibliography" SelectedStyle="\APA.XSL" StyleName="APA"/>
-</file>
-
-<file path=customXml/item3.xml><?xml version="1.0" encoding="utf-8"?>
-<?mso-contentType ?>
-<FormTemplates xmlns="http://schemas.microsoft.com/sharepoint/v3/contenttype/forms">
-  <Display>DocumentLibraryForm</Display>
-  <Edit>DocumentLibraryForm</Edit>
-  <New>DocumentLibraryForm</New>
-</FormTemplates>
 </file>
 
 <file path=customXml/item4.xml><?xml version="1.0" encoding="utf-8"?>
@@ -30958,17 +30958,6 @@
 </file>
 
 <file path=customXml/itemProps1.xml><?xml version="1.0" encoding="utf-8"?>
-<ds:datastoreItem xmlns:ds="http://schemas.openxmlformats.org/officeDocument/2006/customXml" ds:itemID="{0FB482D0-C62D-40F8-A30D-80102D84D1F8}">
-  <ds:schemaRefs>
-    <ds:schemaRef ds:uri="http://schemas.microsoft.com/office/2006/metadata/properties"/>
-    <ds:schemaRef ds:uri="http://schemas.microsoft.com/office/infopath/2007/PartnerControls"/>
-    <ds:schemaRef ds:uri="73616d7f-17b8-4c43-aa5e-25ef7e462a18"/>
-    <ds:schemaRef ds:uri="686b96b7-37ef-4e5c-bc3c-4e780f33c780"/>
-  </ds:schemaRefs>
-</ds:datastoreItem>
-</file>
-
-<file path=customXml/itemProps2.xml><?xml version="1.0" encoding="utf-8"?>
 <ds:datastoreItem xmlns:ds="http://schemas.openxmlformats.org/officeDocument/2006/customXml" ds:itemID="{8C8965D9-0818-43D2-B433-7B321E8F3C6F}">
   <ds:schemaRefs>
     <ds:schemaRef ds:uri="http://schemas.openxmlformats.org/officeDocument/2006/bibliography"/>
@@ -30976,10 +30965,21 @@
 </ds:datastoreItem>
 </file>
 
-<file path=customXml/itemProps3.xml><?xml version="1.0" encoding="utf-8"?>
+<file path=customXml/itemProps2.xml><?xml version="1.0" encoding="utf-8"?>
 <ds:datastoreItem xmlns:ds="http://schemas.openxmlformats.org/officeDocument/2006/customXml" ds:itemID="{CF1FD0AD-7A56-4031-B24D-376004EB8526}">
   <ds:schemaRefs>
     <ds:schemaRef ds:uri="http://schemas.microsoft.com/sharepoint/v3/contenttype/forms"/>
+  </ds:schemaRefs>
+</ds:datastoreItem>
+</file>
+
+<file path=customXml/itemProps3.xml><?xml version="1.0" encoding="utf-8"?>
+<ds:datastoreItem xmlns:ds="http://schemas.openxmlformats.org/officeDocument/2006/customXml" ds:itemID="{0FB482D0-C62D-40F8-A30D-80102D84D1F8}">
+  <ds:schemaRefs>
+    <ds:schemaRef ds:uri="http://schemas.microsoft.com/office/2006/metadata/properties"/>
+    <ds:schemaRef ds:uri="http://schemas.microsoft.com/office/infopath/2007/PartnerControls"/>
+    <ds:schemaRef ds:uri="73616d7f-17b8-4c43-aa5e-25ef7e462a18"/>
+    <ds:schemaRef ds:uri="686b96b7-37ef-4e5c-bc3c-4e780f33c780"/>
   </ds:schemaRefs>
 </ds:datastoreItem>
 </file>

</xml_diff>